<commit_message>
docs: pdfs de cronograma, guiones de sesion y apuntes maquetados tema 3
</commit_message>
<xml_diff>
--- a/Temas EB/Tema 2/Apuntes/Tema 2 2627_maquetado.docx
+++ b/Temas EB/Tema 2/Apuntes/Tema 2 2627_maquetado.docx
@@ -153,7 +153,7 @@
           <w:color w:val="113927"/>
           <w:sz w:val="40"/>
         </w:rPr>
-        <w:t>TEMA 2: LAS POLÍTICAS ACTIVAS DE EMPLEO</w:t>
+        <w:t>TEMA 2: POLÍTICAS ACTIVAS DEL MERCADO DE TRABAJO</w:t>
       </w:r>
     </w:p>
     <w:tbl>
@@ -5591,7 +5591,7 @@
           <w:color w:val="2F3A30"/>
           <w:sz w:val="21"/>
         </w:rPr>
-        <w:t>, aprobado en junio de 2021, es la versión más reciente de esta iniciativa: un documento programático de 69 medidas articuladas en seis ejes. Se ejecuta a través de los servicios públicos de empleo autonómicos y entidades colaboradoras, y la Estrategia 2025-2028 prevé reforzar su conexión con los servicios del Sistema Nacional de Empleo, con atención al perfilado de cada joven, su itinerario personalizado y el acompañamiento especializado. El programa cuenta con cuadros de mando que siguen la situación posterior de los beneficiarios y con una evaluación intermedia de la OCDE, con apoyo de la Comisión Europea.</w:t>
+        <w:t>, aprobado en junio de 2021, es la versión más reciente de esta iniciativa: un documento programático de 69 medidas articuladas en seis ejes. Se ejecuta a través de los servicios públicos de empleo autonómicos y entidades colaboradoras, y la Estrategia 2025-2028 prevé reforzar su conexión con los servicios del Sistema Nacional de Empleo, con atención al perfilado de cada joven, su itinerario personalizado y el acompañamiento especializado. El programa cuenta con cuadros de mando que siguen la situación posterior de los beneficiarios y con una evaluación intermedia de la OCDE, con apoyo de la Comisión Europea. La evidencia internacional sobre programas de empleo juvenil muestra efectos positivos, aunque en promedio modestos (Kluve et al., 2019).</w:t>
       </w:r>
     </w:p>
     <w:p>
@@ -6655,7 +6655,7 @@
           <w:color w:val="2F3A30"/>
           <w:sz w:val="21"/>
         </w:rPr>
-        <w:t xml:space="preserve"> completo añadiría los beneficios: los salarios que obtienen los participantes, las prestaciones por desempleo que dejan de pagarse y los impuestos y cotizaciones que se recaudan. Estos cálculos son el núcleo de la EPD 3.</w:t>
+        <w:t xml:space="preserve"> completo añadiría los beneficios: los salarios que obtienen los participantes, las prestaciones por desempleo que dejan de pagarse y los impuestos y cotizaciones que se recaudan. Estos cálculos son el núcleo de la EPD 3. Para ampliar, puede consultarse el manual de acceso libre de Gertler et al. (2017).</w:t>
       </w:r>
     </w:p>
     <w:p>
@@ -6847,7 +6847,7 @@
           <w:color w:val="2F3A30"/>
           <w:sz w:val="21"/>
         </w:rPr>
-        <w:t xml:space="preserve"> descrito en el epígrafe 6.4. Las evaluaciones centradas solo en resultados inmediatos pueden subestimar la eficacia real de los programas de formación.</w:t>
+        <w:t xml:space="preserve"> descrito en el epígrafe 6.4. Las evaluaciones centradas solo en resultados inmediatos pueden subestimar la eficacia real de los programas de formación, cuyos efectos positivos aparecen con claridad a medio y largo plazo (Sianesi, 2008; Lechner et al., 2011).</w:t>
       </w:r>
     </w:p>
     <w:p>
@@ -6861,7 +6861,7 @@
           <w:color w:val="2F3A30"/>
           <w:sz w:val="21"/>
         </w:rPr>
-        <w:t>En España, la evidencia presenta resultados mixtos. Los estudios sobre subvenciones a la contratación encuentran efectos limitados sobre la estabilidad laboral a medio plazo, con riesgos de peso muerto y sustitución, y la evaluación de la AIReF (2020) coincide en que sus efectos son modestos y poco persistentes. La formación profesional muestra efectos positivos pero moderados, mayores para mujeres y trabajadores de mediana edad y menores para jóvenes y desempleados de muy larga duración. Los programas de creación directa de empleo solo han mostrado eficacia para colectivos muy específicos con grandes dificultades de acceso al empleo.</w:t>
+        <w:t>En España, la evidencia presenta resultados mixtos. Los estudios sobre subvenciones a la contratación encuentran efectos limitados sobre la estabilidad laboral a medio plazo, con riesgos de peso muerto y sustitución, y la evaluación de la AIReF (2020) coincide en que sus efectos son modestos y poco persistentes. La formación profesional muestra efectos positivos pero moderados, mayores para mujeres y trabajadores de mediana edad y menores para jóvenes y desempleados de muy larga duración (Arellano, 2005, 2010; Cueto y Mato, 2009; Ramos et al., 2009). Las herramientas aplicadas durante la Gran Recesión tuvieron efectos desiguales sobre la estabilidad del empleo (Rebollo Sanz y García Pérez, 2021). Los programas de creación directa de empleo solo han mostrado eficacia para colectivos muy específicos con grandes dificultades de acceso al empleo.</w:t>
       </w:r>
     </w:p>
     <w:p>
@@ -7102,7 +7102,7 @@
           <w:color w:val="2F3A30"/>
           <w:sz w:val="21"/>
         </w:rPr>
-        <w:t>. Aunque la ley establece servicios garantizados e itinerarios personalizados, su aplicación exige ratios adecuados de profesionales por demandante, herramientas de perfilado estadístico y sistemas de información integrados. La evidencia muestra que los servicios personalizados y combinados funcionan mejor, pero su provisión a escala requiere capacidades que el sistema aún no tiene plenamente.</w:t>
+        <w:t>. Aunque la ley establece servicios garantizados e itinerarios personalizados, su aplicación exige ratios adecuados de profesionales por demandante, herramientas de perfilado estadístico, que permiten estimar el riesgo de paro de larga duración de cada demandante para asignar mejor los servicios (Desiere et al., 2019; Felgueroso et al., 2018; Rebollo-Sanz, 2018), y sistemas de información integrados. La evidencia muestra que los servicios personalizados y combinados funcionan mejor, pero su provisión a escala requiere capacidades que el sistema aún no tiene plenamente.</w:t>
       </w:r>
     </w:p>
     <w:p>
@@ -7907,7 +7907,7 @@
           <w:color w:val="2F3A30"/>
           <w:sz w:val="19"/>
         </w:rPr>
-        <w:t xml:space="preserve">Andersson, F., Holzer, H. J., Lane, J. I., Rosenblum, D., &amp; Smith, J. (2016). Does federally-funded job training work? Nonexperimental estimates of WIA training impacts using longitudinal data on workers and firms. </w:t>
+        <w:t xml:space="preserve">Arellano, F. A. (2005). Do training programmes get the unemployed back to work?: A look at the Spanish experience. </w:t>
       </w:r>
       <w:r>
         <w:rPr>
@@ -7916,7 +7916,7 @@
           <w:color w:val="2F3A30"/>
           <w:sz w:val="19"/>
         </w:rPr>
-        <w:t>CESifo Working Paper Series No. 6071</w:t>
+        <w:t>Revista de Economía Aplicada, 13</w:t>
       </w:r>
       <w:r>
         <w:rPr>
@@ -7924,7 +7924,7 @@
           <w:color w:val="2F3A30"/>
           <w:sz w:val="19"/>
         </w:rPr>
-        <w:t>.</w:t>
+        <w:t>(39), 87-110.</w:t>
       </w:r>
     </w:p>
     <w:p>
@@ -7939,7 +7939,7 @@
           <w:color w:val="2F3A30"/>
           <w:sz w:val="19"/>
         </w:rPr>
-        <w:t xml:space="preserve">Andersen, T. M., &amp; Svarer, M. (2014). The role of workfare in striking a balance between incentives and insurance in the labour market. </w:t>
+        <w:t xml:space="preserve">Arellano, F. A. (2010). Evaluating the impact of training programmes on the duration of unemployment. </w:t>
       </w:r>
       <w:r>
         <w:rPr>
@@ -7948,7 +7948,7 @@
           <w:color w:val="2F3A30"/>
           <w:sz w:val="19"/>
         </w:rPr>
-        <w:t>Economica, 81</w:t>
+        <w:t>Applied Economics, 42</w:t>
       </w:r>
       <w:r>
         <w:rPr>
@@ -7956,7 +7956,7 @@
           <w:color w:val="2F3A30"/>
           <w:sz w:val="19"/>
         </w:rPr>
-        <w:t>(321), 86-116.</w:t>
+        <w:t>(20), 2591-2605.</w:t>
       </w:r>
     </w:p>
     <w:p>
@@ -7971,7 +7971,7 @@
           <w:color w:val="2F3A30"/>
           <w:sz w:val="19"/>
         </w:rPr>
-        <w:t xml:space="preserve">Arellano, F. A. (2005). Do training programmes get the unemployed back to work?: A look at the Spanish experience. </w:t>
+        <w:t xml:space="preserve">Brown, A. J. G. (2015). Can hiring subsidies benefit the unemployed? </w:t>
       </w:r>
       <w:r>
         <w:rPr>
@@ -7980,7 +7980,7 @@
           <w:color w:val="2F3A30"/>
           <w:sz w:val="19"/>
         </w:rPr>
-        <w:t>Revista de Economía Aplicada, 13</w:t>
+        <w:t>IZA World of Labor</w:t>
       </w:r>
       <w:r>
         <w:rPr>
@@ -7988,7 +7988,7 @@
           <w:color w:val="2F3A30"/>
           <w:sz w:val="19"/>
         </w:rPr>
-        <w:t>(39), 87-110.</w:t>
+        <w:t>, 163.</w:t>
       </w:r>
     </w:p>
     <w:p>
@@ -8003,7 +8003,7 @@
           <w:color w:val="2F3A30"/>
           <w:sz w:val="19"/>
         </w:rPr>
-        <w:t xml:space="preserve">Arellano, F. A. (2010). Evaluating the impact of training programmes on the duration of unemployment. </w:t>
+        <w:t xml:space="preserve">Burtless, G. (1985). Are targeted wage subsidies harmful? Evidence from a wage voucher experiment. </w:t>
       </w:r>
       <w:r>
         <w:rPr>
@@ -8012,7 +8012,7 @@
           <w:color w:val="2F3A30"/>
           <w:sz w:val="19"/>
         </w:rPr>
-        <w:t>Applied Economics, 42</w:t>
+        <w:t>Industrial and Labor Relations Review, 39</w:t>
       </w:r>
       <w:r>
         <w:rPr>
@@ -8020,7 +8020,7 @@
           <w:color w:val="2F3A30"/>
           <w:sz w:val="19"/>
         </w:rPr>
-        <w:t>(20), 2591-2605.</w:t>
+        <w:t>(1), 105-114.</w:t>
       </w:r>
     </w:p>
     <w:p>
@@ -8035,7 +8035,7 @@
           <w:color w:val="2F3A30"/>
           <w:sz w:val="19"/>
         </w:rPr>
-        <w:t xml:space="preserve">Bentolila, S., Dolado, J. J., &amp; Jimeno, J. F. (2012). Reforming an insider-outsider labor market: the Spanish experience. </w:t>
+        <w:t xml:space="preserve">Caliendo, M., Mahlstedt, R., &amp; Mitnik, O. A. (2017). Unobservable, but unimportant? The relevance of usually unobserved variables for the evaluation of labor market policies. </w:t>
       </w:r>
       <w:r>
         <w:rPr>
@@ -8044,7 +8044,7 @@
           <w:color w:val="2F3A30"/>
           <w:sz w:val="19"/>
         </w:rPr>
-        <w:t>IZA Journal of European Labor Studies, 1</w:t>
+        <w:t>Labour Economics, 46</w:t>
       </w:r>
       <w:r>
         <w:rPr>
@@ -8052,7 +8052,7 @@
           <w:color w:val="2F3A30"/>
           <w:sz w:val="19"/>
         </w:rPr>
-        <w:t>(1), 4.</w:t>
+        <w:t>, 14-25.</w:t>
       </w:r>
     </w:p>
     <w:p>
@@ -8067,7 +8067,7 @@
           <w:color w:val="2F3A30"/>
           <w:sz w:val="19"/>
         </w:rPr>
-        <w:t xml:space="preserve">Brown, A. J. G. (2015). Can hiring subsidies benefit the unemployed? </w:t>
+        <w:t xml:space="preserve">Card, D., Kluve, J., &amp; Weber, A. (2010). Active Labour Market Policy Evaluations: A Meta-Analysis. </w:t>
       </w:r>
       <w:r>
         <w:rPr>
@@ -8076,7 +8076,7 @@
           <w:color w:val="2F3A30"/>
           <w:sz w:val="19"/>
         </w:rPr>
-        <w:t>IZA World of Labor</w:t>
+        <w:t>The Economic Journal, 120</w:t>
       </w:r>
       <w:r>
         <w:rPr>
@@ -8084,7 +8084,7 @@
           <w:color w:val="2F3A30"/>
           <w:sz w:val="19"/>
         </w:rPr>
-        <w:t>, 163.</w:t>
+        <w:t>(548), F452-F477.</w:t>
       </w:r>
     </w:p>
     <w:p>
@@ -8099,7 +8099,7 @@
           <w:color w:val="2F3A30"/>
           <w:sz w:val="19"/>
         </w:rPr>
-        <w:t xml:space="preserve">Brown, A. J., &amp; Koettl, J. (2015). Active labor market programs - employment gain or fiscal drain? </w:t>
+        <w:t xml:space="preserve">Card, D., Kluve, J., &amp; Weber, A. (2018). What works? A meta analysis of recent active labor market program evaluations. </w:t>
       </w:r>
       <w:r>
         <w:rPr>
@@ -8108,7 +8108,7 @@
           <w:color w:val="2F3A30"/>
           <w:sz w:val="19"/>
         </w:rPr>
-        <w:t>IZA Journal of Labor Economics, 4</w:t>
+        <w:t>Journal of the European Economic Association, 16</w:t>
       </w:r>
       <w:r>
         <w:rPr>
@@ -8116,7 +8116,7 @@
           <w:color w:val="2F3A30"/>
           <w:sz w:val="19"/>
         </w:rPr>
-        <w:t>(1), 12.</w:t>
+        <w:t>(3), 894-931.</w:t>
       </w:r>
     </w:p>
     <w:p>
@@ -8131,7 +8131,7 @@
           <w:color w:val="2F3A30"/>
           <w:sz w:val="19"/>
         </w:rPr>
-        <w:t xml:space="preserve">Burtless, G. (1985). Are targeted wage subsidies harmful? Evidence from a wage voucher experiment. </w:t>
+        <w:t xml:space="preserve">Crépon, B., Duflo, E., Gurgand, M., Rathelot, R., &amp; Zamora, P. (2013). Do labor market policies have displacement effects? Evidence from a clustered randomized experiment. </w:t>
       </w:r>
       <w:r>
         <w:rPr>
@@ -8140,7 +8140,7 @@
           <w:color w:val="2F3A30"/>
           <w:sz w:val="19"/>
         </w:rPr>
-        <w:t>Industrial and Labor Relations Review, 39</w:t>
+        <w:t>The Quarterly Journal of Economics, 128</w:t>
       </w:r>
       <w:r>
         <w:rPr>
@@ -8148,7 +8148,7 @@
           <w:color w:val="2F3A30"/>
           <w:sz w:val="19"/>
         </w:rPr>
-        <w:t>(1), 105-114.</w:t>
+        <w:t>(2), 531-580.</w:t>
       </w:r>
     </w:p>
     <w:p>
@@ -8163,7 +8163,7 @@
           <w:color w:val="2F3A30"/>
           <w:sz w:val="19"/>
         </w:rPr>
-        <w:t xml:space="preserve">Caliendo, M., Mahlstedt, R., &amp; Mitnik, O. A. (2017). Unobservable, but unimportant? The relevance of usually unobserved variables for the evaluation of labor market policies. </w:t>
+        <w:t xml:space="preserve">Cueto, B., &amp; Mato, F. J. (2009). An analysis of a training programme for the unemployed in Spain. </w:t>
       </w:r>
       <w:r>
         <w:rPr>
@@ -8172,7 +8172,7 @@
           <w:color w:val="2F3A30"/>
           <w:sz w:val="19"/>
         </w:rPr>
-        <w:t>Labour Economics, 46</w:t>
+        <w:t>The European Journal of Comparative Economics, 6</w:t>
       </w:r>
       <w:r>
         <w:rPr>
@@ -8180,7 +8180,7 @@
           <w:color w:val="2F3A30"/>
           <w:sz w:val="19"/>
         </w:rPr>
-        <w:t>, 14-25.</w:t>
+        <w:t>(2), 289-307.</w:t>
       </w:r>
     </w:p>
     <w:p>
@@ -8195,7 +8195,7 @@
           <w:color w:val="2F3A30"/>
           <w:sz w:val="19"/>
         </w:rPr>
-        <w:t xml:space="preserve">Card, D., Kluve, J., &amp; Weber, A. (2010). Active Labour Market Policy Evaluations: A Meta-Analysis. </w:t>
+        <w:t xml:space="preserve">Desiere, S., Langenbucher, K., &amp; Struyven, L. (2019). Statistical profiling in public employment services: An international comparison. </w:t>
       </w:r>
       <w:r>
         <w:rPr>
@@ -8204,7 +8204,7 @@
           <w:color w:val="2F3A30"/>
           <w:sz w:val="19"/>
         </w:rPr>
-        <w:t>The Economic Journal, 120</w:t>
+        <w:t>OECD Social, Employment and Migration Working Papers No. 224</w:t>
       </w:r>
       <w:r>
         <w:rPr>
@@ -8212,7 +8212,7 @@
           <w:color w:val="2F3A30"/>
           <w:sz w:val="19"/>
         </w:rPr>
-        <w:t>(548), F452-F477.</w:t>
+        <w:t>.</w:t>
       </w:r>
     </w:p>
     <w:p>
@@ -8227,7 +8227,7 @@
           <w:color w:val="2F3A30"/>
           <w:sz w:val="19"/>
         </w:rPr>
-        <w:t xml:space="preserve">Chetty, R. (2008). Moral hazard versus liquidity and optimal unemployment insurance. </w:t>
+        <w:t xml:space="preserve">Felgueroso, F., García-Pérez, J. I., &amp; Jansen, M. (2018). El uso del perfilado estadístico en las políticas activas de empleo en España. </w:t>
       </w:r>
       <w:r>
         <w:rPr>
@@ -8236,7 +8236,7 @@
           <w:color w:val="2F3A30"/>
           <w:sz w:val="19"/>
         </w:rPr>
-        <w:t>Journal of Political Economy, 116</w:t>
+        <w:t>Cuadernos de Información Económica, 265</w:t>
       </w:r>
       <w:r>
         <w:rPr>
@@ -8244,7 +8244,7 @@
           <w:color w:val="2F3A30"/>
           <w:sz w:val="19"/>
         </w:rPr>
-        <w:t>(2), 173-234.</w:t>
+        <w:t>, 11-20.</w:t>
       </w:r>
     </w:p>
     <w:p>
@@ -8259,7 +8259,7 @@
           <w:color w:val="2F3A30"/>
           <w:sz w:val="19"/>
         </w:rPr>
-        <w:t xml:space="preserve">Card, D., Kluve, J., &amp; Weber, A. (2018). What works? A meta analysis of recent active labor market program evaluations. </w:t>
+        <w:t xml:space="preserve">García-Pérez, J. I., &amp; Rebollo Sanz, Y. (2009a). Do wage subsidies affect the subsequent employment stability of permanent workers?: The case of Spain. </w:t>
       </w:r>
       <w:r>
         <w:rPr>
@@ -8268,7 +8268,7 @@
           <w:color w:val="2F3A30"/>
           <w:sz w:val="19"/>
         </w:rPr>
-        <w:t>Journal of the European Economic Association, 16</w:t>
+        <w:t>Moneda y Crédito, 228</w:t>
       </w:r>
       <w:r>
         <w:rPr>
@@ -8276,7 +8276,7 @@
           <w:color w:val="2F3A30"/>
           <w:sz w:val="19"/>
         </w:rPr>
-        <w:t>(3), 894-931.</w:t>
+        <w:t>, 65-103.</w:t>
       </w:r>
     </w:p>
     <w:p>
@@ -8291,7 +8291,7 @@
           <w:color w:val="2F3A30"/>
           <w:sz w:val="19"/>
         </w:rPr>
-        <w:t xml:space="preserve">Crépon, B., Duflo, E., Gurgand, M., Rathelot, R., &amp; Zamora, P. (2013). Do labor market policies have displacement effects? Evidence from a clustered randomized experiment. </w:t>
+        <w:t xml:space="preserve">García-Pérez, J. I., &amp; Rebollo Sanz, Y. (2009b). The use of permanent contracts across Spanish regions: Do regional wage subsidies work? </w:t>
       </w:r>
       <w:r>
         <w:rPr>
@@ -8300,7 +8300,7 @@
           <w:color w:val="2F3A30"/>
           <w:sz w:val="19"/>
         </w:rPr>
-        <w:t>The Quarterly Journal of Economics, 128</w:t>
+        <w:t>Investigaciones Económicas, 33</w:t>
       </w:r>
       <w:r>
         <w:rPr>
@@ -8308,7 +8308,7 @@
           <w:color w:val="2F3A30"/>
           <w:sz w:val="19"/>
         </w:rPr>
-        <w:t>(2), 531-580.</w:t>
+        <w:t>(1), 97-130.</w:t>
       </w:r>
     </w:p>
     <w:p>
@@ -8323,7 +8323,7 @@
           <w:color w:val="2F3A30"/>
           <w:sz w:val="19"/>
         </w:rPr>
-        <w:t xml:space="preserve">Cueto, B., &amp; Mato, F. J. (2009). An analysis of a training programme for the unemployed in Spain. </w:t>
+        <w:t xml:space="preserve">Gertler, P. J., Martínez, S., Premand, P., Rawlings, L. B., &amp; Vermeersch, C. M. J. (2017). </w:t>
       </w:r>
       <w:r>
         <w:rPr>
@@ -8332,7 +8332,7 @@
           <w:color w:val="2F3A30"/>
           <w:sz w:val="19"/>
         </w:rPr>
-        <w:t>The European Journal of Comparative Economics, 6</w:t>
+        <w:t>La evaluación de impacto en la práctica</w:t>
       </w:r>
       <w:r>
         <w:rPr>
@@ -8340,7 +8340,7 @@
           <w:color w:val="2F3A30"/>
           <w:sz w:val="19"/>
         </w:rPr>
-        <w:t>(2), 289-307.</w:t>
+        <w:t xml:space="preserve"> (2.ª ed.). Banco Interamericano de Desarrollo y Banco Mundial.</w:t>
       </w:r>
     </w:p>
     <w:p>
@@ -8355,7 +8355,7 @@
           <w:color w:val="2F3A30"/>
           <w:sz w:val="19"/>
         </w:rPr>
-        <w:t xml:space="preserve">Desiere, S., Langenbucher, K., &amp; Struyven, L. (2019). Statistical profiling in public employment services: An international comparison. </w:t>
+        <w:t xml:space="preserve">Kluve, J. (2010). The effectiveness of European active labor market programs. </w:t>
       </w:r>
       <w:r>
         <w:rPr>
@@ -8364,7 +8364,7 @@
           <w:color w:val="2F3A30"/>
           <w:sz w:val="19"/>
         </w:rPr>
-        <w:t>OECD Social, Employment and Migration Working Papers No. 224</w:t>
+        <w:t>Labour Economics, 17</w:t>
       </w:r>
       <w:r>
         <w:rPr>
@@ -8372,7 +8372,7 @@
           <w:color w:val="2F3A30"/>
           <w:sz w:val="19"/>
         </w:rPr>
-        <w:t>.</w:t>
+        <w:t>(6), 904-918.</w:t>
       </w:r>
     </w:p>
     <w:p>
@@ -8387,7 +8387,7 @@
           <w:color w:val="2F3A30"/>
           <w:sz w:val="19"/>
         </w:rPr>
-        <w:t xml:space="preserve">Dolado, J. J., Lalé, E., &amp; Siassi, N. (2021). From dual to unified employment protection: Transition and steady state. </w:t>
+        <w:t xml:space="preserve">Kluve, J., Puerto, S., Robalino, D., Romero, J. M., Rother, F., Stöterau, J., Weidenkaff, F., &amp; Witte, M. (2019). Do youth employment programs improve labor market outcomes? A quantitative review. </w:t>
       </w:r>
       <w:r>
         <w:rPr>
@@ -8396,7 +8396,7 @@
           <w:color w:val="2F3A30"/>
           <w:sz w:val="19"/>
         </w:rPr>
-        <w:t>Quantitative Economics, 12</w:t>
+        <w:t>World Development, 114</w:t>
       </w:r>
       <w:r>
         <w:rPr>
@@ -8404,7 +8404,7 @@
           <w:color w:val="2F3A30"/>
           <w:sz w:val="19"/>
         </w:rPr>
-        <w:t>(2), 547-585.</w:t>
+        <w:t>, 237-253.</w:t>
       </w:r>
     </w:p>
     <w:p>
@@ -8419,7 +8419,7 @@
           <w:color w:val="2F3A30"/>
           <w:sz w:val="19"/>
         </w:rPr>
-        <w:t xml:space="preserve">Felgueroso, F., García-Pérez, J. I., &amp; Jansen, M. (2018). El uso del perfilado estadístico en las políticas activas de empleo en España. </w:t>
+        <w:t xml:space="preserve">Lechner, M., Miquel, R., &amp; Wunsch, C. (2011). Long-run effects of public sector sponsored training in West Germany. </w:t>
       </w:r>
       <w:r>
         <w:rPr>
@@ -8428,7 +8428,7 @@
           <w:color w:val="2F3A30"/>
           <w:sz w:val="19"/>
         </w:rPr>
-        <w:t>Cuadernos de Información Económica, 265</w:t>
+        <w:t>Journal of the European Economic Association, 9</w:t>
       </w:r>
       <w:r>
         <w:rPr>
@@ -8436,7 +8436,7 @@
           <w:color w:val="2F3A30"/>
           <w:sz w:val="19"/>
         </w:rPr>
-        <w:t>, 11-20.</w:t>
+        <w:t>(4), 742-784.</w:t>
       </w:r>
     </w:p>
     <w:p>
@@ -8451,7 +8451,7 @@
           <w:color w:val="2F3A30"/>
           <w:sz w:val="19"/>
         </w:rPr>
-        <w:t xml:space="preserve">García-Pérez, J. I. (2016). El efecto de las prestaciones por desempleo sobre la tasa de paro en España. </w:t>
+        <w:t xml:space="preserve">Ramos, R., Sanromá, E., &amp; Simón, H. (2009). Evaluación del impacto de las políticas activas de empleo en Cataluña. </w:t>
       </w:r>
       <w:r>
         <w:rPr>
@@ -8460,7 +8460,7 @@
           <w:color w:val="2F3A30"/>
           <w:sz w:val="19"/>
         </w:rPr>
-        <w:t>Fedea Policy Papers, 2016/26</w:t>
+        <w:t>Revista de Economía Aplicada, 17</w:t>
       </w:r>
       <w:r>
         <w:rPr>
@@ -8468,7 +8468,7 @@
           <w:color w:val="2F3A30"/>
           <w:sz w:val="19"/>
         </w:rPr>
-        <w:t>.</w:t>
+        <w:t>(51), 113-134.</w:t>
       </w:r>
     </w:p>
     <w:p>
@@ -8483,7 +8483,7 @@
           <w:color w:val="2F3A30"/>
           <w:sz w:val="19"/>
         </w:rPr>
-        <w:t xml:space="preserve">García-Pérez, J. I., &amp; Rebollo Sanz, Y. (2009a). Do wage subsidies affect the subsequent employment stability of permanent workers?: The case of Spain. </w:t>
+        <w:t xml:space="preserve">Rebollo-Sanz, Y. (2018). El perfilado estadístico como herramienta para mejorar la eficiencia de las políticas activas de empleo. En A. de la Fuente &amp; R. Doménech (Eds.), </w:t>
       </w:r>
       <w:r>
         <w:rPr>
@@ -8492,7 +8492,7 @@
           <w:color w:val="2F3A30"/>
           <w:sz w:val="19"/>
         </w:rPr>
-        <w:t>Moneda y Crédito, 228</w:t>
+        <w:t>Las reformas necesarias en las políticas activas de empleo</w:t>
       </w:r>
       <w:r>
         <w:rPr>
@@ -8500,7 +8500,7 @@
           <w:color w:val="2F3A30"/>
           <w:sz w:val="19"/>
         </w:rPr>
-        <w:t>, 65-103.</w:t>
+        <w:t xml:space="preserve"> (pp. 45-78). Fedea.</w:t>
       </w:r>
     </w:p>
     <w:p>
@@ -8515,7 +8515,7 @@
           <w:color w:val="2F3A30"/>
           <w:sz w:val="19"/>
         </w:rPr>
-        <w:t xml:space="preserve">García-Pérez, J. I., &amp; Rebollo Sanz, Y. (2009b). The use of permanent contracts across Spanish regions: Do regional wage subsidies work? </w:t>
+        <w:t xml:space="preserve">Rebollo Sanz, Y., &amp; García Pérez, J. I. (2021). Are the ALMP tools implemented during the Great Recession effective in increasing employment stability? Evidence for Spain. </w:t>
       </w:r>
       <w:r>
         <w:rPr>
@@ -8524,7 +8524,7 @@
           <w:color w:val="2F3A30"/>
           <w:sz w:val="19"/>
         </w:rPr>
-        <w:t>Investigaciones Económicas, 33</w:t>
+        <w:t>European Journal of Law and Economics, 51</w:t>
       </w:r>
       <w:r>
         <w:rPr>
@@ -8532,7 +8532,7 @@
           <w:color w:val="2F3A30"/>
           <w:sz w:val="19"/>
         </w:rPr>
-        <w:t>(1), 97-130.</w:t>
+        <w:t>, 187-235.</w:t>
       </w:r>
     </w:p>
     <w:p>
@@ -8547,7 +8547,7 @@
           <w:color w:val="2F3A30"/>
           <w:sz w:val="19"/>
         </w:rPr>
-        <w:t xml:space="preserve">Gertler, P. J., Martínez, S., Premand, P., Rawlings, L. B., &amp; Vermeersch, C. M. J. (2017). </w:t>
+        <w:t xml:space="preserve">Sianesi, B. (2008). Differential effects of active labour market programs for the unemployed. </w:t>
       </w:r>
       <w:r>
         <w:rPr>
@@ -8556,7 +8556,7 @@
           <w:color w:val="2F3A30"/>
           <w:sz w:val="19"/>
         </w:rPr>
-        <w:t>La evaluación de impacto en la práctica</w:t>
+        <w:t>Labour Economics, 15</w:t>
       </w:r>
       <w:r>
         <w:rPr>
@@ -8564,7 +8564,7 @@
           <w:color w:val="2F3A30"/>
           <w:sz w:val="19"/>
         </w:rPr>
-        <w:t xml:space="preserve"> (2.ª ed.). Banco Interamericano de Desarrollo y Banco Mundial.</w:t>
+        <w:t>(3), 370-399.</w:t>
       </w:r>
     </w:p>
     <w:p>
@@ -8579,7 +8579,41 @@
           <w:color w:val="2F3A30"/>
           <w:sz w:val="19"/>
         </w:rPr>
-        <w:t>INAEM (2015). Evaluación del impacto de las políticas activas de empleo en Aragón. Instituto Aragonés de Empleo.</w:t>
+        <w:t xml:space="preserve">UGT y Universidad Carlos III de Madrid (2026). </w:t>
+      </w:r>
+      <w:r>
+        <w:rPr>
+          <w:rFonts w:ascii="Calibri" w:hAnsi="Calibri"/>
+          <w:i/>
+          <w:color w:val="2F3A30"/>
+          <w:sz w:val="19"/>
+        </w:rPr>
+        <w:t>Retos de las políticas de empleo en España en el marco institucional de la Unión Europea</w:t>
+      </w:r>
+      <w:r>
+        <w:rPr>
+          <w:rFonts w:ascii="Calibri" w:hAnsi="Calibri"/>
+          <w:color w:val="2F3A30"/>
+          <w:sz w:val="19"/>
+        </w:rPr>
+        <w:t>. Presentado el 15 de septiembre de 2026.</w:t>
+      </w:r>
+    </w:p>
+    <w:p>
+      <w:pPr>
+        <w:pStyle w:val="Heading2"/>
+        <w:keepNext/>
+        <w:spacing w:before="360" w:after="100"/>
+        <w:jc w:val="left"/>
+      </w:pPr>
+      <w:r>
+        <w:rPr>
+          <w:rFonts w:ascii="Outfit" w:hAnsi="Outfit"/>
+          <w:b/>
+          <w:color w:val="76927A"/>
+          <w:sz w:val="25"/>
+        </w:rPr>
+        <w:t>Bibliografía complementaria</w:t>
       </w:r>
     </w:p>
     <w:p>
@@ -8594,7 +8628,7 @@
           <w:color w:val="2F3A30"/>
           <w:sz w:val="19"/>
         </w:rPr>
-        <w:t xml:space="preserve">Jimeno, J. F., Martínez-Matute, M., &amp; Mora-Sanguinetti, J. S. (2020). Employment protection legislation, labor courts, and effective firing costs. </w:t>
+        <w:t xml:space="preserve">O'Connell, P. J., McGuinness, S., Kelly, E., &amp; Walsh, J. R. (2012). Activation in Ireland: An evaluation of the National Employment Action Plan. </w:t>
       </w:r>
       <w:r>
         <w:rPr>
@@ -8603,7 +8637,7 @@
           <w:color w:val="2F3A30"/>
           <w:sz w:val="19"/>
         </w:rPr>
-        <w:t>IZA Journal of Labor Economics, 9</w:t>
+        <w:t>ESRI Research Series No. 28</w:t>
       </w:r>
       <w:r>
         <w:rPr>
@@ -8611,7 +8645,7 @@
           <w:color w:val="2F3A30"/>
           <w:sz w:val="19"/>
         </w:rPr>
-        <w:t>(1), 1-35.</w:t>
+        <w:t>.</w:t>
       </w:r>
     </w:p>
     <w:p>
@@ -8626,7 +8660,7 @@
           <w:color w:val="2F3A30"/>
           <w:sz w:val="19"/>
         </w:rPr>
-        <w:t xml:space="preserve">Kluve, J. (2010). The effectiveness of European active labor market programs. </w:t>
+        <w:t xml:space="preserve">Andersson, F., Holzer, H. J., Lane, J. I., Rosenblum, D., &amp; Smith, J. (2016). Does federally-funded job training work? Nonexperimental estimates of WIA training impacts using longitudinal data on workers and firms. </w:t>
       </w:r>
       <w:r>
         <w:rPr>
@@ -8635,7 +8669,7 @@
           <w:color w:val="2F3A30"/>
           <w:sz w:val="19"/>
         </w:rPr>
-        <w:t>Labour Economics, 17</w:t>
+        <w:t>CESifo Working Paper Series No. 6071</w:t>
       </w:r>
       <w:r>
         <w:rPr>
@@ -8643,7 +8677,7 @@
           <w:color w:val="2F3A30"/>
           <w:sz w:val="19"/>
         </w:rPr>
-        <w:t>(6), 904-918.</w:t>
+        <w:t>.</w:t>
       </w:r>
     </w:p>
     <w:p>
@@ -8658,7 +8692,7 @@
           <w:color w:val="2F3A30"/>
           <w:sz w:val="19"/>
         </w:rPr>
-        <w:t xml:space="preserve">Kluve, J., Puerto, S., Robalino, D., Romero, J. M., Rother, F., Stöterau, J., Weidenkaff, F., &amp; Witte, M. (2019). Do youth employment programs improve labor market outcomes? A quantitative review. </w:t>
+        <w:t xml:space="preserve">Andersen, T. M., &amp; Svarer, M. (2014). The role of workfare in striking a balance between incentives and insurance in the labour market. </w:t>
       </w:r>
       <w:r>
         <w:rPr>
@@ -8667,7 +8701,7 @@
           <w:color w:val="2F3A30"/>
           <w:sz w:val="19"/>
         </w:rPr>
-        <w:t>World Development, 114</w:t>
+        <w:t>Economica, 81</w:t>
       </w:r>
       <w:r>
         <w:rPr>
@@ -8675,7 +8709,7 @@
           <w:color w:val="2F3A30"/>
           <w:sz w:val="19"/>
         </w:rPr>
-        <w:t>, 237-253.</w:t>
+        <w:t>(321), 86-116.</w:t>
       </w:r>
     </w:p>
     <w:p>
@@ -8690,7 +8724,7 @@
           <w:color w:val="2F3A30"/>
           <w:sz w:val="19"/>
         </w:rPr>
-        <w:t xml:space="preserve">Kolsrud, J., Landais, C., Nilsson, P., &amp; Spinnewijn, J. (2018). The optimal timing of unemployment benefits: Theory and evidence from Sweden. </w:t>
+        <w:t xml:space="preserve">Brown, A. J., &amp; Koettl, J. (2015). Active labor market programs - employment gain or fiscal drain? </w:t>
       </w:r>
       <w:r>
         <w:rPr>
@@ -8699,7 +8733,7 @@
           <w:color w:val="2F3A30"/>
           <w:sz w:val="19"/>
         </w:rPr>
-        <w:t>American Economic Review, 108</w:t>
+        <w:t>IZA Journal of Labor Economics, 4</w:t>
       </w:r>
       <w:r>
         <w:rPr>
@@ -8707,7 +8741,7 @@
           <w:color w:val="2F3A30"/>
           <w:sz w:val="19"/>
         </w:rPr>
-        <w:t>(4-5), 985-1033.</w:t>
+        <w:t>(1), 12.</w:t>
       </w:r>
     </w:p>
     <w:p>
@@ -8722,7 +8756,22 @@
           <w:color w:val="2F3A30"/>
           <w:sz w:val="19"/>
         </w:rPr>
-        <w:t xml:space="preserve">Landais, C., Michaillat, P., &amp; Saez, E. (2018). A macroeconomic approach to optimal unemployment insurance: Theory. </w:t>
+        <w:t>INAEM (2015). Evaluación del impacto de las políticas activas de empleo en Aragón. Instituto Aragonés de Empleo.</w:t>
+      </w:r>
+    </w:p>
+    <w:p>
+      <w:pPr>
+        <w:spacing w:after="60"/>
+        <w:ind w:left="432" w:hanging="432"/>
+        <w:jc w:val="left"/>
+      </w:pPr>
+      <w:r>
+        <w:rPr>
+          <w:rFonts w:ascii="Calibri" w:hAnsi="Calibri"/>
+          <w:color w:val="2F3A30"/>
+          <w:sz w:val="19"/>
+        </w:rPr>
+        <w:t xml:space="preserve">Lechner, M., Miquel, R., &amp; Wunsch, C. (2007). The curse and blessing of training the unemployed in a changing economy: The case of East Germany after unification. </w:t>
       </w:r>
       <w:r>
         <w:rPr>
@@ -8731,7 +8780,7 @@
           <w:color w:val="2F3A30"/>
           <w:sz w:val="19"/>
         </w:rPr>
-        <w:t>American Economic Journal: Economic Policy, 10</w:t>
+        <w:t>German Economic Review, 8</w:t>
       </w:r>
       <w:r>
         <w:rPr>
@@ -8739,7 +8788,7 @@
           <w:color w:val="2F3A30"/>
           <w:sz w:val="19"/>
         </w:rPr>
-        <w:t>(2), 152-81.</w:t>
+        <w:t>(4), 468-509.</w:t>
       </w:r>
     </w:p>
     <w:p>
@@ -8754,7 +8803,7 @@
           <w:color w:val="2F3A30"/>
           <w:sz w:val="19"/>
         </w:rPr>
-        <w:t xml:space="preserve">Lechner, M., Miquel, R., &amp; Wunsch, C. (2007). The curse and blessing of training the unemployed in a changing economy: The case of East Germany after unification. </w:t>
+        <w:t xml:space="preserve">Loxha, A., &amp; Morgandi, M. (2014). Profiling the unemployed: A review of OECD experiences and implications for emerging economies. </w:t>
       </w:r>
       <w:r>
         <w:rPr>
@@ -8763,7 +8812,7 @@
           <w:color w:val="2F3A30"/>
           <w:sz w:val="19"/>
         </w:rPr>
-        <w:t>German Economic Review, 8</w:t>
+        <w:t>World Bank Social Protection and Labor Discussion Paper No. 1424</w:t>
       </w:r>
       <w:r>
         <w:rPr>
@@ -8771,359 +8820,7 @@
           <w:color w:val="2F3A30"/>
           <w:sz w:val="19"/>
         </w:rPr>
-        <w:t>(4), 468-509.</w:t>
-      </w:r>
-    </w:p>
-    <w:p>
-      <w:pPr>
-        <w:spacing w:after="60"/>
-        <w:ind w:left="432" w:hanging="432"/>
-        <w:jc w:val="left"/>
-      </w:pPr>
-      <w:r>
-        <w:rPr>
-          <w:rFonts w:ascii="Calibri" w:hAnsi="Calibri"/>
-          <w:color w:val="2F3A30"/>
-          <w:sz w:val="19"/>
-        </w:rPr>
-        <w:t xml:space="preserve">Lechner, M., Miquel, R., &amp; Wunsch, C. (2011). Long-run effects of public sector sponsored training in West Germany. </w:t>
-      </w:r>
-      <w:r>
-        <w:rPr>
-          <w:rFonts w:ascii="Calibri" w:hAnsi="Calibri"/>
-          <w:i/>
-          <w:color w:val="2F3A30"/>
-          <w:sz w:val="19"/>
-        </w:rPr>
-        <w:t>Journal of the European Economic Association, 9</w:t>
-      </w:r>
-      <w:r>
-        <w:rPr>
-          <w:rFonts w:ascii="Calibri" w:hAnsi="Calibri"/>
-          <w:color w:val="2F3A30"/>
-          <w:sz w:val="19"/>
-        </w:rPr>
-        <w:t>(4), 742-784.</w:t>
-      </w:r>
-    </w:p>
-    <w:p>
-      <w:pPr>
-        <w:spacing w:after="60"/>
-        <w:ind w:left="432" w:hanging="432"/>
-        <w:jc w:val="left"/>
-      </w:pPr>
-      <w:r>
-        <w:rPr>
-          <w:rFonts w:ascii="Calibri" w:hAnsi="Calibri"/>
-          <w:color w:val="2F3A30"/>
-          <w:sz w:val="19"/>
-        </w:rPr>
-        <w:t xml:space="preserve">Loxha, A., &amp; Morgandi, M. (2014). Profiling the unemployed: A review of OECD experiences and implications for emerging economies. </w:t>
-      </w:r>
-      <w:r>
-        <w:rPr>
-          <w:rFonts w:ascii="Calibri" w:hAnsi="Calibri"/>
-          <w:i/>
-          <w:color w:val="2F3A30"/>
-          <w:sz w:val="19"/>
-        </w:rPr>
-        <w:t>World Bank Social Protection and Labor Discussion Paper No. 1424</w:t>
-      </w:r>
-      <w:r>
-        <w:rPr>
-          <w:rFonts w:ascii="Calibri" w:hAnsi="Calibri"/>
-          <w:color w:val="2F3A30"/>
-          <w:sz w:val="19"/>
-        </w:rPr>
         <w:t>.</w:t>
-      </w:r>
-    </w:p>
-    <w:p>
-      <w:pPr>
-        <w:spacing w:after="60"/>
-        <w:ind w:left="432" w:hanging="432"/>
-        <w:jc w:val="left"/>
-      </w:pPr>
-      <w:r>
-        <w:rPr>
-          <w:rFonts w:ascii="Calibri" w:hAnsi="Calibri"/>
-          <w:color w:val="2F3A30"/>
-          <w:sz w:val="19"/>
-        </w:rPr>
-        <w:t xml:space="preserve">Muñoz de Bustillo, R., &amp; Antón, J. I. (2013). Those were the days, my friend: The public sector and the economic crisis in Spain. En D. Vaughan-Whitehead (Ed.), </w:t>
-      </w:r>
-      <w:r>
-        <w:rPr>
-          <w:rFonts w:ascii="Calibri" w:hAnsi="Calibri"/>
-          <w:i/>
-          <w:color w:val="2F3A30"/>
-          <w:sz w:val="19"/>
-        </w:rPr>
-        <w:t>Public Sector Shock: The Impact of Policy Retrenchment in Europe</w:t>
-      </w:r>
-      <w:r>
-        <w:rPr>
-          <w:rFonts w:ascii="Calibri" w:hAnsi="Calibri"/>
-          <w:color w:val="2F3A30"/>
-          <w:sz w:val="19"/>
-        </w:rPr>
-        <w:t xml:space="preserve"> (pp. 361-398). Edward Elgar Publishing.</w:t>
-      </w:r>
-    </w:p>
-    <w:p>
-      <w:pPr>
-        <w:spacing w:after="60"/>
-        <w:ind w:left="432" w:hanging="432"/>
-        <w:jc w:val="left"/>
-      </w:pPr>
-      <w:r>
-        <w:rPr>
-          <w:rFonts w:ascii="Calibri" w:hAnsi="Calibri"/>
-          <w:color w:val="2F3A30"/>
-          <w:sz w:val="19"/>
-        </w:rPr>
-        <w:t xml:space="preserve">O'Connell, P. J., McGuinness, S., Kelly, E., &amp; Walsh, J. R. (2012). Activation in Ireland: An evaluation of the National Employment Action Plan. </w:t>
-      </w:r>
-      <w:r>
-        <w:rPr>
-          <w:rFonts w:ascii="Calibri" w:hAnsi="Calibri"/>
-          <w:i/>
-          <w:color w:val="2F3A30"/>
-          <w:sz w:val="19"/>
-        </w:rPr>
-        <w:t>ESRI Research Series No. 28</w:t>
-      </w:r>
-      <w:r>
-        <w:rPr>
-          <w:rFonts w:ascii="Calibri" w:hAnsi="Calibri"/>
-          <w:color w:val="2F3A30"/>
-          <w:sz w:val="19"/>
-        </w:rPr>
-        <w:t>.</w:t>
-      </w:r>
-    </w:p>
-    <w:p>
-      <w:pPr>
-        <w:spacing w:after="60"/>
-        <w:ind w:left="432" w:hanging="432"/>
-        <w:jc w:val="left"/>
-      </w:pPr>
-      <w:r>
-        <w:rPr>
-          <w:rFonts w:ascii="Calibri" w:hAnsi="Calibri"/>
-          <w:color w:val="2F3A30"/>
-          <w:sz w:val="19"/>
-        </w:rPr>
-        <w:t xml:space="preserve">Ramos, R., Sanromá, E., &amp; Simón, H. (2009). Evaluación del impacto de las políticas activas de empleo en Cataluña. </w:t>
-      </w:r>
-      <w:r>
-        <w:rPr>
-          <w:rFonts w:ascii="Calibri" w:hAnsi="Calibri"/>
-          <w:i/>
-          <w:color w:val="2F3A30"/>
-          <w:sz w:val="19"/>
-        </w:rPr>
-        <w:t>Revista de Economía Aplicada, 17</w:t>
-      </w:r>
-      <w:r>
-        <w:rPr>
-          <w:rFonts w:ascii="Calibri" w:hAnsi="Calibri"/>
-          <w:color w:val="2F3A30"/>
-          <w:sz w:val="19"/>
-        </w:rPr>
-        <w:t>(51), 113-134.</w:t>
-      </w:r>
-    </w:p>
-    <w:p>
-      <w:pPr>
-        <w:spacing w:after="60"/>
-        <w:ind w:left="432" w:hanging="432"/>
-        <w:jc w:val="left"/>
-      </w:pPr>
-      <w:r>
-        <w:rPr>
-          <w:rFonts w:ascii="Calibri" w:hAnsi="Calibri"/>
-          <w:color w:val="2F3A30"/>
-          <w:sz w:val="19"/>
-        </w:rPr>
-        <w:t xml:space="preserve">Rebollo-Sanz, Y. (2018). El perfilado estadístico como herramienta para mejorar la eficiencia de las políticas activas de empleo. En A. de la Fuente &amp; R. Doménech (Eds.), </w:t>
-      </w:r>
-      <w:r>
-        <w:rPr>
-          <w:rFonts w:ascii="Calibri" w:hAnsi="Calibri"/>
-          <w:i/>
-          <w:color w:val="2F3A30"/>
-          <w:sz w:val="19"/>
-        </w:rPr>
-        <w:t>Las reformas necesarias en las políticas activas de empleo</w:t>
-      </w:r>
-      <w:r>
-        <w:rPr>
-          <w:rFonts w:ascii="Calibri" w:hAnsi="Calibri"/>
-          <w:color w:val="2F3A30"/>
-          <w:sz w:val="19"/>
-        </w:rPr>
-        <w:t xml:space="preserve"> (pp. 45-78). Fedea.</w:t>
-      </w:r>
-    </w:p>
-    <w:p>
-      <w:pPr>
-        <w:spacing w:after="60"/>
-        <w:ind w:left="432" w:hanging="432"/>
-        <w:jc w:val="left"/>
-      </w:pPr>
-      <w:r>
-        <w:rPr>
-          <w:rFonts w:ascii="Calibri" w:hAnsi="Calibri"/>
-          <w:color w:val="2F3A30"/>
-          <w:sz w:val="19"/>
-        </w:rPr>
-        <w:t xml:space="preserve">Rebollo Sanz, Y., &amp; García Pérez, J. I. (2021). Are the ALMP tools implemented during the Great Recession effective in increasing employment stability? Evidence for Spain. </w:t>
-      </w:r>
-      <w:r>
-        <w:rPr>
-          <w:rFonts w:ascii="Calibri" w:hAnsi="Calibri"/>
-          <w:i/>
-          <w:color w:val="2F3A30"/>
-          <w:sz w:val="19"/>
-        </w:rPr>
-        <w:t>European Journal of Law and Economics, 51</w:t>
-      </w:r>
-      <w:r>
-        <w:rPr>
-          <w:rFonts w:ascii="Calibri" w:hAnsi="Calibri"/>
-          <w:color w:val="2F3A30"/>
-          <w:sz w:val="19"/>
-        </w:rPr>
-        <w:t>, 187-235.</w:t>
-      </w:r>
-    </w:p>
-    <w:p>
-      <w:pPr>
-        <w:spacing w:after="60"/>
-        <w:ind w:left="432" w:hanging="432"/>
-        <w:jc w:val="left"/>
-      </w:pPr>
-      <w:r>
-        <w:rPr>
-          <w:rFonts w:ascii="Calibri" w:hAnsi="Calibri"/>
-          <w:color w:val="2F3A30"/>
-          <w:sz w:val="19"/>
-        </w:rPr>
-        <w:t xml:space="preserve">Rebollo-Sanz, Y., &amp; Rodríguez-Planas, N. (2020). When the going gets tough... Financial incentives, duration of unemployment and job-match quality. </w:t>
-      </w:r>
-      <w:r>
-        <w:rPr>
-          <w:rFonts w:ascii="Calibri" w:hAnsi="Calibri"/>
-          <w:i/>
-          <w:color w:val="2F3A30"/>
-          <w:sz w:val="19"/>
-        </w:rPr>
-        <w:t>Journal of Human Resources, 55</w:t>
-      </w:r>
-      <w:r>
-        <w:rPr>
-          <w:rFonts w:ascii="Calibri" w:hAnsi="Calibri"/>
-          <w:color w:val="2F3A30"/>
-          <w:sz w:val="19"/>
-        </w:rPr>
-        <w:t>(1), 119-161.</w:t>
-      </w:r>
-    </w:p>
-    <w:p>
-      <w:pPr>
-        <w:spacing w:after="60"/>
-        <w:ind w:left="432" w:hanging="432"/>
-        <w:jc w:val="left"/>
-      </w:pPr>
-      <w:r>
-        <w:rPr>
-          <w:rFonts w:ascii="Calibri" w:hAnsi="Calibri"/>
-          <w:color w:val="2F3A30"/>
-          <w:sz w:val="19"/>
-        </w:rPr>
-        <w:t xml:space="preserve">Shavell, S., &amp; Weiss, L. (1979). The optimal payment of unemployment insurance benefits over time. </w:t>
-      </w:r>
-      <w:r>
-        <w:rPr>
-          <w:rFonts w:ascii="Calibri" w:hAnsi="Calibri"/>
-          <w:i/>
-          <w:color w:val="2F3A30"/>
-          <w:sz w:val="19"/>
-        </w:rPr>
-        <w:t>Journal of Political Economy, 87</w:t>
-      </w:r>
-      <w:r>
-        <w:rPr>
-          <w:rFonts w:ascii="Calibri" w:hAnsi="Calibri"/>
-          <w:color w:val="2F3A30"/>
-          <w:sz w:val="19"/>
-        </w:rPr>
-        <w:t>(6), 1347-1362.</w:t>
-      </w:r>
-    </w:p>
-    <w:p>
-      <w:pPr>
-        <w:spacing w:after="60"/>
-        <w:ind w:left="432" w:hanging="432"/>
-        <w:jc w:val="left"/>
-      </w:pPr>
-      <w:r>
-        <w:rPr>
-          <w:rFonts w:ascii="Calibri" w:hAnsi="Calibri"/>
-          <w:color w:val="2F3A30"/>
-          <w:sz w:val="19"/>
-        </w:rPr>
-        <w:t xml:space="preserve">Sianesi, B. (2008). Differential effects of active labour market programs for the unemployed. </w:t>
-      </w:r>
-      <w:r>
-        <w:rPr>
-          <w:rFonts w:ascii="Calibri" w:hAnsi="Calibri"/>
-          <w:i/>
-          <w:color w:val="2F3A30"/>
-          <w:sz w:val="19"/>
-        </w:rPr>
-        <w:t>Labour Economics, 15</w:t>
-      </w:r>
-      <w:r>
-        <w:rPr>
-          <w:rFonts w:ascii="Calibri" w:hAnsi="Calibri"/>
-          <w:color w:val="2F3A30"/>
-          <w:sz w:val="19"/>
-        </w:rPr>
-        <w:t>(3), 370-399.</w:t>
-      </w:r>
-    </w:p>
-    <w:p>
-      <w:pPr>
-        <w:spacing w:after="60"/>
-        <w:ind w:left="432" w:hanging="432"/>
-        <w:jc w:val="left"/>
-      </w:pPr>
-      <w:r>
-        <w:rPr>
-          <w:rFonts w:ascii="Calibri" w:hAnsi="Calibri"/>
-          <w:color w:val="2F3A30"/>
-          <w:sz w:val="19"/>
-        </w:rPr>
-        <w:t xml:space="preserve">UGT y Universidad Carlos III de Madrid (2026). </w:t>
-      </w:r>
-      <w:r>
-        <w:rPr>
-          <w:rFonts w:ascii="Calibri" w:hAnsi="Calibri"/>
-          <w:i/>
-          <w:color w:val="2F3A30"/>
-          <w:sz w:val="19"/>
-        </w:rPr>
-        <w:t>Retos de las políticas de empleo en España en el marco institucional de la Unión Europea</w:t>
-      </w:r>
-      <w:r>
-        <w:rPr>
-          <w:rFonts w:ascii="Calibri" w:hAnsi="Calibri"/>
-          <w:color w:val="2F3A30"/>
-          <w:sz w:val="19"/>
-        </w:rPr>
-        <w:t>. Presentado el 15 de septiembre de 2026.</w:t>
       </w:r>
     </w:p>
     <w:p>
@@ -9525,7 +9222,7 @@
         <w:color w:val="76927A"/>
         <w:sz w:val="16"/>
       </w:rPr>
-      <w:t>POLÍTICAS SOCIOLABORALES Y DE EMPLEO · TEMA 2: LAS POLÍTICAS ACTIVAS DE EMPLEO</w:t>
+      <w:t>POLÍTICAS SOCIOLABORALES Y DE EMPLEO · TEMA 2: POLÍTICAS ACTIVAS DEL MERCADO DE TRABAJO</w:t>
     </w:r>
   </w:p>
 </w:hdr>

</xml_diff>